<commit_message>
Cache system account S3 connections for reuse. Close user S3 connection after completion
</commit_message>
<xml_diff>
--- a/doc/development/S3 Integration Properties Tuning.docx
+++ b/doc/development/S3 Integration Properties Tuning.docx
@@ -2103,6 +2103,119 @@
                 <w:b/>
                 <w:sz w:val="18"/>
               </w:rPr>
+              <w:t>crtMaxNativeMemoryLimitInBytes</w:t>
+            </w:r>
+          </w:p>
+        </w:tc>
+        <w:tc>
+          <w:tcPr>
+            <w:tcW w:type="dxa" w:w="6048"/>
+          </w:tcPr>
+          <w:p>
+            <w:r/>
+            <w:r>
+              <w:rPr>
+                <w:sz w:val="18"/>
+              </w:rPr>
+              <w:t>Max native (off-heap, outside -Xmx) memory each CRT S3 client may use to buffer parts (bytes). Clients are shared per system account + S3 URL/region, so total ≈ this × archive endpoints in use (user S3 accounts get their own). Higher = more parts in flight; lower = protects host from native OOM. Min 1 GiB; size against minimumUploadPartSize (e.g. 2 GiB for 50 MiB parts).</w:t>
+            </w:r>
+          </w:p>
+        </w:tc>
+        <w:tc>
+          <w:tcPr>
+            <w:tcW w:type="dxa" w:w="576"/>
+          </w:tcPr>
+          <w:p>
+            <w:pPr>
+              <w:jc w:val="center"/>
+            </w:pPr>
+            <w:r/>
+            <w:r>
+              <w:rPr>
+                <w:sz w:val="18"/>
+              </w:rPr>
+              <w:t>—</w:t>
+            </w:r>
+          </w:p>
+        </w:tc>
+        <w:tc>
+          <w:tcPr>
+            <w:tcW w:type="dxa" w:w="576"/>
+          </w:tcPr>
+          <w:p>
+            <w:pPr>
+              <w:jc w:val="center"/>
+            </w:pPr>
+            <w:r/>
+            <w:r>
+              <w:rPr>
+                <w:sz w:val="18"/>
+              </w:rPr>
+              <w:t>✅</w:t>
+            </w:r>
+          </w:p>
+        </w:tc>
+        <w:tc>
+          <w:tcPr>
+            <w:tcW w:type="dxa" w:w="720"/>
+          </w:tcPr>
+          <w:p>
+            <w:pPr>
+              <w:jc w:val="center"/>
+            </w:pPr>
+            <w:r/>
+            <w:r>
+              <w:rPr>
+                <w:sz w:val="18"/>
+              </w:rPr>
+              <w:t>—</w:t>
+            </w:r>
+          </w:p>
+        </w:tc>
+        <w:tc>
+          <w:tcPr>
+            <w:tcW w:type="dxa" w:w="1296"/>
+          </w:tcPr>
+          <w:p>
+            <w:r/>
+            <w:r>
+              <w:rPr>
+                <w:rFonts w:ascii="Consolas" w:hAnsi="Consolas"/>
+                <w:sz w:val="18"/>
+              </w:rPr>
+              <w:t>2147483648</w:t>
+            </w:r>
+          </w:p>
+        </w:tc>
+        <w:tc>
+          <w:tcPr>
+            <w:tcW w:type="dxa" w:w="2016"/>
+          </w:tcPr>
+          <w:p>
+            <w:r/>
+            <w:r>
+              <w:rPr>
+                <w:rFonts w:ascii="Consolas" w:hAnsi="Consolas"/>
+                <w:sz w:val="18"/>
+              </w:rPr>
+              <w:t>2147483648</w:t>
+            </w:r>
+          </w:p>
+        </w:tc>
+      </w:tr>
+      <w:tr>
+        <w:tc>
+          <w:tcPr>
+            <w:tcW w:type="dxa" w:w="2448"/>
+          </w:tcPr>
+          <w:p>
+            <w:r/>
+            <w:r>
+              <w:rPr>
+                <w:rFonts w:ascii="Consolas" w:hAnsi="Consolas"/>
+                <w:b/>
+                <w:sz w:val="18"/>
+              </w:rPr>
               <w:t>nettynio.maxInFlightParts</w:t>
             </w:r>
           </w:p>

</xml_diff>